<commit_message>
fix(soa): enlarge Remaining Amortization table font in the printed SOA
User-reported: the table (5pt cell text, 7pt heading) was unreadable once
printed. Bumped to 9pt cells / 10pt heading, matching the readability of
the rest of the document - table structure/columns unchanged.

Co-Authored-By: Claude Sonnet 5 <noreply@anthropic.com>
</commit_message>
<xml_diff>
--- a/app/easycashbackend/templates/SOA.docx
+++ b/app/easycashbackend/templates/SOA.docx
@@ -2635,8 +2635,8 @@
       <w:r>
         <w:rPr>
           <w:rFonts w:ascii="Arial" w:hAnsi="Arial" w:cs="Arial"/>
-          <w:sz w:val="14"/>
-          <w:szCs w:val="14"/>
+          <w:sz w:val="20"/>
+          <w:szCs w:val="20"/>
         </w:rPr>
         <w:t>Remaining Amortization</w:t>
       </w:r>
@@ -2664,15 +2664,15 @@
               <w:jc w:val="center"/>
               <w:rPr>
                 <w:rFonts w:ascii="Arial" w:hAnsi="Arial" w:cs="Arial"/>
-                <w:sz w:val="10"/>
-                <w:szCs w:val="10"/>
-              </w:rPr>
-            </w:pPr>
-            <w:r>
-              <w:rPr>
-                <w:rFonts w:ascii="Arial" w:hAnsi="Arial" w:cs="Arial"/>
-                <w:sz w:val="10"/>
-                <w:szCs w:val="10"/>
+                <w:sz w:val="18"/>
+                <w:szCs w:val="18"/>
+              </w:rPr>
+            </w:pPr>
+            <w:r>
+              <w:rPr>
+                <w:rFonts w:ascii="Arial" w:hAnsi="Arial" w:cs="Arial"/>
+                <w:sz w:val="18"/>
+                <w:szCs w:val="18"/>
               </w:rPr>
               <w:t>Due Date</w:t>
             </w:r>
@@ -2687,15 +2687,15 @@
               <w:jc w:val="center"/>
               <w:rPr>
                 <w:rFonts w:ascii="Arial" w:hAnsi="Arial" w:cs="Arial"/>
-                <w:sz w:val="10"/>
-                <w:szCs w:val="10"/>
-              </w:rPr>
-            </w:pPr>
-            <w:r>
-              <w:rPr>
-                <w:rFonts w:ascii="Arial" w:hAnsi="Arial" w:cs="Arial"/>
-                <w:sz w:val="10"/>
-                <w:szCs w:val="10"/>
+                <w:sz w:val="18"/>
+                <w:szCs w:val="18"/>
+              </w:rPr>
+            </w:pPr>
+            <w:r>
+              <w:rPr>
+                <w:rFonts w:ascii="Arial" w:hAnsi="Arial" w:cs="Arial"/>
+                <w:sz w:val="18"/>
+                <w:szCs w:val="18"/>
               </w:rPr>
               <w:t>Principal</w:t>
             </w:r>
@@ -2710,15 +2710,15 @@
               <w:jc w:val="center"/>
               <w:rPr>
                 <w:rFonts w:ascii="Arial" w:hAnsi="Arial" w:cs="Arial"/>
-                <w:sz w:val="10"/>
-                <w:szCs w:val="10"/>
-              </w:rPr>
-            </w:pPr>
-            <w:r>
-              <w:rPr>
-                <w:rFonts w:ascii="Arial" w:hAnsi="Arial" w:cs="Arial"/>
-                <w:sz w:val="10"/>
-                <w:szCs w:val="10"/>
+                <w:sz w:val="18"/>
+                <w:szCs w:val="18"/>
+              </w:rPr>
+            </w:pPr>
+            <w:r>
+              <w:rPr>
+                <w:rFonts w:ascii="Arial" w:hAnsi="Arial" w:cs="Arial"/>
+                <w:sz w:val="18"/>
+                <w:szCs w:val="18"/>
               </w:rPr>
               <w:t>Interest</w:t>
             </w:r>
@@ -2733,15 +2733,15 @@
               <w:jc w:val="center"/>
               <w:rPr>
                 <w:rFonts w:ascii="Arial" w:hAnsi="Arial" w:cs="Arial"/>
-                <w:sz w:val="10"/>
-                <w:szCs w:val="10"/>
-              </w:rPr>
-            </w:pPr>
-            <w:r>
-              <w:rPr>
-                <w:rFonts w:ascii="Arial" w:hAnsi="Arial" w:cs="Arial"/>
-                <w:sz w:val="10"/>
-                <w:szCs w:val="10"/>
+                <w:sz w:val="18"/>
+                <w:szCs w:val="18"/>
+              </w:rPr>
+            </w:pPr>
+            <w:r>
+              <w:rPr>
+                <w:rFonts w:ascii="Arial" w:hAnsi="Arial" w:cs="Arial"/>
+                <w:sz w:val="18"/>
+                <w:szCs w:val="18"/>
               </w:rPr>
               <w:t>Total due</w:t>
             </w:r>
@@ -2758,15 +2758,15 @@
               <w:jc w:val="center"/>
               <w:rPr>
                 <w:rFonts w:ascii="Arial" w:hAnsi="Arial" w:cs="Arial"/>
-                <w:sz w:val="10"/>
-                <w:szCs w:val="10"/>
-              </w:rPr>
-            </w:pPr>
-            <w:r>
-              <w:rPr>
-                <w:rFonts w:ascii="Arial" w:hAnsi="Arial" w:cs="Arial"/>
-                <w:sz w:val="10"/>
-                <w:szCs w:val="10"/>
+                <w:sz w:val="18"/>
+                <w:szCs w:val="18"/>
+              </w:rPr>
+            </w:pPr>
+            <w:r>
+              <w:rPr>
+                <w:rFonts w:ascii="Arial" w:hAnsi="Arial" w:cs="Arial"/>
+                <w:sz w:val="18"/>
+                <w:szCs w:val="18"/>
               </w:rPr>
               <w:t>{#</w:t>
             </w:r>
@@ -2774,8 +2774,8 @@
             <w:r>
               <w:rPr>
                 <w:rFonts w:ascii="Arial" w:hAnsi="Arial" w:cs="Arial"/>
-                <w:sz w:val="10"/>
-                <w:szCs w:val="10"/>
+                <w:sz w:val="18"/>
+                <w:szCs w:val="18"/>
               </w:rPr>
               <w:t>RemainingSchedule}{</w:t>
             </w:r>
@@ -2783,8 +2783,8 @@
             <w:r>
               <w:rPr>
                 <w:rFonts w:ascii="Arial" w:hAnsi="Arial" w:cs="Arial"/>
-                <w:sz w:val="10"/>
-                <w:szCs w:val="10"/>
+                <w:sz w:val="18"/>
+                <w:szCs w:val="18"/>
               </w:rPr>
               <w:t>DueDate}</w:t>
             </w:r>
@@ -2799,15 +2799,15 @@
               <w:jc w:val="center"/>
               <w:rPr>
                 <w:rFonts w:ascii="Arial" w:hAnsi="Arial" w:cs="Arial"/>
-                <w:sz w:val="10"/>
-                <w:szCs w:val="10"/>
-              </w:rPr>
-            </w:pPr>
-            <w:r>
-              <w:rPr>
-                <w:rFonts w:ascii="Arial" w:hAnsi="Arial" w:cs="Arial"/>
-                <w:sz w:val="10"/>
-                <w:szCs w:val="10"/>
+                <w:sz w:val="18"/>
+                <w:szCs w:val="18"/>
+              </w:rPr>
+            </w:pPr>
+            <w:r>
+              <w:rPr>
+                <w:rFonts w:ascii="Arial" w:hAnsi="Arial" w:cs="Arial"/>
+                <w:sz w:val="18"/>
+                <w:szCs w:val="18"/>
               </w:rPr>
               <w:t>{Principal}</w:t>
             </w:r>
@@ -2822,15 +2822,15 @@
               <w:jc w:val="center"/>
               <w:rPr>
                 <w:rFonts w:ascii="Arial" w:hAnsi="Arial" w:cs="Arial"/>
-                <w:sz w:val="10"/>
-                <w:szCs w:val="10"/>
-              </w:rPr>
-            </w:pPr>
-            <w:r>
-              <w:rPr>
-                <w:rFonts w:ascii="Arial" w:hAnsi="Arial" w:cs="Arial"/>
-                <w:sz w:val="10"/>
-                <w:szCs w:val="10"/>
+                <w:sz w:val="18"/>
+                <w:szCs w:val="18"/>
+              </w:rPr>
+            </w:pPr>
+            <w:r>
+              <w:rPr>
+                <w:rFonts w:ascii="Arial" w:hAnsi="Arial" w:cs="Arial"/>
+                <w:sz w:val="18"/>
+                <w:szCs w:val="18"/>
               </w:rPr>
               <w:t>{Interest}</w:t>
             </w:r>
@@ -2845,15 +2845,15 @@
               <w:jc w:val="center"/>
               <w:rPr>
                 <w:rFonts w:ascii="Arial" w:hAnsi="Arial" w:cs="Arial"/>
-                <w:sz w:val="10"/>
-                <w:szCs w:val="10"/>
-              </w:rPr>
-            </w:pPr>
-            <w:r>
-              <w:rPr>
-                <w:rFonts w:ascii="Arial" w:hAnsi="Arial" w:cs="Arial"/>
-                <w:sz w:val="10"/>
-                <w:szCs w:val="10"/>
+                <w:sz w:val="18"/>
+                <w:szCs w:val="18"/>
+              </w:rPr>
+            </w:pPr>
+            <w:r>
+              <w:rPr>
+                <w:rFonts w:ascii="Arial" w:hAnsi="Arial" w:cs="Arial"/>
+                <w:sz w:val="18"/>
+                <w:szCs w:val="18"/>
               </w:rPr>
               <w:t>{</w:t>
             </w:r>
@@ -2861,8 +2861,8 @@
             <w:r>
               <w:rPr>
                 <w:rFonts w:ascii="Arial" w:hAnsi="Arial" w:cs="Arial"/>
-                <w:sz w:val="10"/>
-                <w:szCs w:val="10"/>
+                <w:sz w:val="18"/>
+                <w:szCs w:val="18"/>
               </w:rPr>
               <w:t>TotalDue</w:t>
             </w:r>
@@ -2870,8 +2870,8 @@
             <w:r>
               <w:rPr>
                 <w:rFonts w:ascii="Arial" w:hAnsi="Arial" w:cs="Arial"/>
-                <w:sz w:val="10"/>
-                <w:szCs w:val="10"/>
+                <w:sz w:val="18"/>
+                <w:szCs w:val="18"/>
               </w:rPr>
               <w:t>}{/</w:t>
             </w:r>
@@ -2879,8 +2879,8 @@
             <w:r>
               <w:rPr>
                 <w:rFonts w:ascii="Arial" w:hAnsi="Arial" w:cs="Arial"/>
-                <w:sz w:val="10"/>
-                <w:szCs w:val="10"/>
+                <w:sz w:val="18"/>
+                <w:szCs w:val="18"/>
               </w:rPr>
               <w:t>RemainingSchedule</w:t>
             </w:r>
@@ -2888,8 +2888,8 @@
             <w:r>
               <w:rPr>
                 <w:rFonts w:ascii="Arial" w:hAnsi="Arial" w:cs="Arial"/>
-                <w:sz w:val="10"/>
-                <w:szCs w:val="10"/>
+                <w:sz w:val="18"/>
+                <w:szCs w:val="18"/>
               </w:rPr>
               <w:t>}</w:t>
             </w:r>

</xml_diff>

<commit_message>
fix(soa): widen Remaining Amortization columns so figures never wrap
Follow-up to the prior font-size bump - the 9pt cell text no longer fit
the original narrow column widths (851-1413 twips), forcing digits like
"1266.40" onto two lines. Widened all four columns (Due Date 2200,
Principal/Interest/Total due 1900 each, 7900 twips total) - well within
the ~10466 twips of usable A4 width, and verified via LibreOffice
headless conversion that the statement still renders on a single page.

Co-Authored-By: Claude Sonnet 5 <noreply@anthropic.com>
</commit_message>
<xml_diff>
--- a/app/easycashbackend/templates/SOA.docx
+++ b/app/easycashbackend/templates/SOA.docx
@@ -2644,20 +2644,20 @@
     <w:tbl>
       <w:tblPr>
         <w:tblStyle w:val="TableGrid"/>
-        <w:tblW w:w="0" w:type="auto"/>
+        <w:tblW w:w="7900" w:type="dxa"/>
         <w:tblLayout w:type="fixed"/>
         <w:tblLook w:val="04A0" w:firstRow="1" w:lastRow="0" w:firstColumn="1" w:lastColumn="0" w:noHBand="0" w:noVBand="1"/>
       </w:tblPr>
       <w:tblGrid>
-        <w:gridCol w:w="1413"/>
-        <w:gridCol w:w="992"/>
-        <w:gridCol w:w="851"/>
-        <w:gridCol w:w="1134"/>
+        <w:gridCol w:w="2200"/>
+        <w:gridCol w:w="1900"/>
+        <w:gridCol w:w="1900"/>
+        <w:gridCol w:w="1900"/>
       </w:tblGrid>
       <w:tr>
         <w:tc>
           <w:tcPr>
-            <w:tcW w:w="1413" w:type="dxa"/>
+            <w:tcW w:w="2200" w:type="dxa"/>
           </w:tcPr>
           <w:p>
             <w:pPr>
@@ -2680,7 +2680,7 @@
         </w:tc>
         <w:tc>
           <w:tcPr>
-            <w:tcW w:w="992" w:type="dxa"/>
+            <w:tcW w:w="1900" w:type="dxa"/>
           </w:tcPr>
           <w:p>
             <w:pPr>
@@ -2703,7 +2703,7 @@
         </w:tc>
         <w:tc>
           <w:tcPr>
-            <w:tcW w:w="851" w:type="dxa"/>
+            <w:tcW w:w="1900" w:type="dxa"/>
           </w:tcPr>
           <w:p>
             <w:pPr>
@@ -2726,7 +2726,7 @@
         </w:tc>
         <w:tc>
           <w:tcPr>
-            <w:tcW w:w="1134" w:type="dxa"/>
+            <w:tcW w:w="1900" w:type="dxa"/>
           </w:tcPr>
           <w:p>
             <w:pPr>
@@ -2751,7 +2751,7 @@
       <w:tr>
         <w:tc>
           <w:tcPr>
-            <w:tcW w:w="1413" w:type="dxa"/>
+            <w:tcW w:w="2200" w:type="dxa"/>
           </w:tcPr>
           <w:p>
             <w:pPr>
@@ -2792,7 +2792,7 @@
         </w:tc>
         <w:tc>
           <w:tcPr>
-            <w:tcW w:w="992" w:type="dxa"/>
+            <w:tcW w:w="1900" w:type="dxa"/>
           </w:tcPr>
           <w:p>
             <w:pPr>
@@ -2815,7 +2815,7 @@
         </w:tc>
         <w:tc>
           <w:tcPr>
-            <w:tcW w:w="851" w:type="dxa"/>
+            <w:tcW w:w="1900" w:type="dxa"/>
           </w:tcPr>
           <w:p>
             <w:pPr>
@@ -2838,7 +2838,7 @@
         </w:tc>
         <w:tc>
           <w:tcPr>
-            <w:tcW w:w="1134" w:type="dxa"/>
+            <w:tcW w:w="1900" w:type="dxa"/>
           </w:tcPr>
           <w:p>
             <w:pPr>

</xml_diff>

<commit_message>
fix(soa): keep the printed SOA on a single A4 page after the font bump
Enlarging the Remaining Amortization table font (previous commit) grew
each row enough that a 12-installment loan with a co-borrower spilled its
last line (the "electronically generated" footer) onto a near-empty
page 2. Reclaimed the space by:
- Bottom page margin 720 -> 300 twips (top left as-is; the header's own
  height already governs top spacing).
- Document-wide default paragraph spacing-after 160 -> 40 twips (only
  affects blank/spacer paragraphs outside tables - all table content
  already used the TableGrid style's own after=0, so real content is
  untouched).

Verified via LibreOffice headless conversion with a synthetic 12-month,
co-borrower-present SOA (the tightest realistic case) - back to 1 page.

Co-Authored-By: Claude Sonnet 5 <noreply@anthropic.com>
</commit_message>
<xml_diff>
--- a/app/easycashbackend/templates/SOA.docx
+++ b/app/easycashbackend/templates/SOA.docx
@@ -2661,6 +2661,7 @@
           </w:tcPr>
           <w:p>
             <w:pPr>
+              <w:spacing w:before="0" w:after="0" w:line="240" w:lineRule="auto"/>
               <w:jc w:val="center"/>
               <w:rPr>
                 <w:rFonts w:ascii="Arial" w:hAnsi="Arial" w:cs="Arial"/>
@@ -2684,6 +2685,7 @@
           </w:tcPr>
           <w:p>
             <w:pPr>
+              <w:spacing w:before="0" w:after="0" w:line="240" w:lineRule="auto"/>
               <w:jc w:val="center"/>
               <w:rPr>
                 <w:rFonts w:ascii="Arial" w:hAnsi="Arial" w:cs="Arial"/>
@@ -2707,6 +2709,7 @@
           </w:tcPr>
           <w:p>
             <w:pPr>
+              <w:spacing w:before="0" w:after="0" w:line="240" w:lineRule="auto"/>
               <w:jc w:val="center"/>
               <w:rPr>
                 <w:rFonts w:ascii="Arial" w:hAnsi="Arial" w:cs="Arial"/>
@@ -2730,6 +2733,7 @@
           </w:tcPr>
           <w:p>
             <w:pPr>
+              <w:spacing w:before="0" w:after="0" w:line="240" w:lineRule="auto"/>
               <w:jc w:val="center"/>
               <w:rPr>
                 <w:rFonts w:ascii="Arial" w:hAnsi="Arial" w:cs="Arial"/>
@@ -2755,6 +2759,7 @@
           </w:tcPr>
           <w:p>
             <w:pPr>
+              <w:spacing w:before="0" w:after="0" w:line="240" w:lineRule="auto"/>
               <w:jc w:val="center"/>
               <w:rPr>
                 <w:rFonts w:ascii="Arial" w:hAnsi="Arial" w:cs="Arial"/>
@@ -2796,6 +2801,7 @@
           </w:tcPr>
           <w:p>
             <w:pPr>
+              <w:spacing w:before="0" w:after="0" w:line="240" w:lineRule="auto"/>
               <w:jc w:val="center"/>
               <w:rPr>
                 <w:rFonts w:ascii="Arial" w:hAnsi="Arial" w:cs="Arial"/>
@@ -2819,6 +2825,7 @@
           </w:tcPr>
           <w:p>
             <w:pPr>
+              <w:spacing w:before="0" w:after="0" w:line="240" w:lineRule="auto"/>
               <w:jc w:val="center"/>
               <w:rPr>
                 <w:rFonts w:ascii="Arial" w:hAnsi="Arial" w:cs="Arial"/>
@@ -2842,6 +2849,7 @@
           </w:tcPr>
           <w:p>
             <w:pPr>
+              <w:spacing w:before="0" w:after="0" w:line="240" w:lineRule="auto"/>
               <w:jc w:val="center"/>
               <w:rPr>
                 <w:rFonts w:ascii="Arial" w:hAnsi="Arial" w:cs="Arial"/>
@@ -3243,7 +3251,7 @@
     <w:sectPr>
       <w:headerReference w:type="default" r:id="rId7"/>
       <w:pgSz w:w="11906" w:h="16838" w:code="9"/>
-      <w:pgMar w:top="720" w:right="720" w:bottom="720" w:left="720" w:header="708" w:footer="708" w:gutter="0"/>
+      <w:pgMar w:top="720" w:right="720" w:bottom="300" w:left="720" w:header="708" w:footer="708" w:gutter="0"/>
       <w:cols w:space="708"/>
       <w:docGrid w:linePitch="360"/>
     </w:sectPr>
@@ -3501,7 +3509,7 @@
     </w:rPrDefault>
     <w:pPrDefault>
       <w:pPr>
-        <w:spacing w:after="160" w:line="259" w:lineRule="auto"/>
+        <w:spacing w:after="40" w:line="240" w:lineRule="auto"/>
       </w:pPr>
     </w:pPrDefault>
   </w:docDefaults>

</xml_diff>

<commit_message>
fix(soa): show a single Penalty as-of date for prospective loans
A prospective loan's printed "Penalty {FromDate} / {ToDate}" implied
staff chose a real date range, when only "To date" (the Penalty form's
"As of date" field) is ever user-entered - "From date" is a display-only
derived value. Now prints "Penalty {ToDate}" for a prospective loan,
matching the Accrued Interest line's own single-date pattern. A migrated
loan keeps the real From/To range, since both dates are genuinely
staff-entered there (no live figure to derive from).

Added an IsProspectiveLoan merge field and a docxtemplater
{#IsProspectiveLoan}/{^IsProspectiveLoan} conditional in the template to
pick between the two. Verified both branches via LibreOffice conversion.

Co-Authored-By: Claude Sonnet 5 <noreply@anthropic.com>
</commit_message>
<xml_diff>
--- a/app/easycashbackend/templates/SOA.docx
+++ b/app/easycashbackend/templates/SOA.docx
@@ -1824,43 +1824,55 @@
                 <w:sz w:val="14"/>
                 <w:szCs w:val="14"/>
               </w:rPr>
-              <w:t>{</w:t>
-            </w:r>
-            <w:proofErr w:type="spellStart"/>
+              <w:t xml:space="preserve">{#IsProspectiveLoan}{</w:t>
+            </w:r>
             <w:r>
               <w:rPr>
                 <w:rFonts w:ascii="Arial" w:hAnsi="Arial" w:cs="Arial"/>
                 <w:sz w:val="14"/>
                 <w:szCs w:val="14"/>
               </w:rPr>
-              <w:t>PenaltyFromDate</w:t>
-            </w:r>
-            <w:proofErr w:type="spellEnd"/>
+              <w:t xml:space="preserve">PenaltyToDate</w:t>
+            </w:r>
             <w:r>
               <w:rPr>
                 <w:rFonts w:ascii="Arial" w:hAnsi="Arial" w:cs="Arial"/>
                 <w:sz w:val="14"/>
                 <w:szCs w:val="14"/>
               </w:rPr>
-              <w:t>} / {</w:t>
-            </w:r>
-            <w:proofErr w:type="spellStart"/>
+              <w:t xml:space="preserve">}{/IsProspectiveLoan}{^IsProspectiveLoan}{</w:t>
+            </w:r>
             <w:r>
               <w:rPr>
                 <w:rFonts w:ascii="Arial" w:hAnsi="Arial" w:cs="Arial"/>
                 <w:sz w:val="14"/>
                 <w:szCs w:val="14"/>
               </w:rPr>
-              <w:t>PenaltyToDate</w:t>
-            </w:r>
-            <w:proofErr w:type="spellEnd"/>
+              <w:t xml:space="preserve">PenaltyFromDate</w:t>
+            </w:r>
             <w:r>
               <w:rPr>
                 <w:rFonts w:ascii="Arial" w:hAnsi="Arial" w:cs="Arial"/>
                 <w:sz w:val="14"/>
                 <w:szCs w:val="14"/>
               </w:rPr>
-              <w:t>}</w:t>
+              <w:t xml:space="preserve">} / {</w:t>
+            </w:r>
+            <w:r>
+              <w:rPr>
+                <w:rFonts w:ascii="Arial" w:hAnsi="Arial" w:cs="Arial"/>
+                <w:sz w:val="14"/>
+                <w:szCs w:val="14"/>
+              </w:rPr>
+              <w:t xml:space="preserve">PenaltyToDate</w:t>
+            </w:r>
+            <w:r>
+              <w:rPr>
+                <w:rFonts w:ascii="Arial" w:hAnsi="Arial" w:cs="Arial"/>
+                <w:sz w:val="14"/>
+                <w:szCs w:val="14"/>
+              </w:rPr>
+              <w:t xml:space="preserve">}{/IsProspectiveLoan}</w:t>
             </w:r>
           </w:p>
         </w:tc>

</xml_diff>

<commit_message>
fix(soa): narrow the Remaining Amortization columns
User request. The Principal/Interest/Total due headers were already
wider than any real figure in them (e.g. "3,683.39"), so there was room
to spare. Due Date kept fixed-but-tight (2000 twips - fits "September 4,
2026", the longest realistic date, with no wrap) rather than true
autofit, per user's own call after I flagged that autofit tables in
Word/LibreOffice are what caused the wrapping bug fixed earlier this
session - predictable fixed widths avoid reintroducing it. Other three
columns narrowed 1900 -> 1400 twips each (7900 -> 6200 total).

Verified via LibreOffice conversion with the user's own real loan data
(SML-REG_00381, 6-row schedule) - no wrapping, single page.

Co-Authored-By: Claude Sonnet 5 <noreply@anthropic.com>
</commit_message>
<xml_diff>
--- a/app/easycashbackend/templates/SOA.docx
+++ b/app/easycashbackend/templates/SOA.docx
@@ -2664,20 +2664,20 @@
     <w:tbl>
       <w:tblPr>
         <w:tblStyle w:val="TableGrid"/>
-        <w:tblW w:w="7900" w:type="dxa"/>
+        <w:tblW w:w="6200" w:type="dxa"/>
         <w:tblLayout w:type="fixed"/>
         <w:tblLook w:val="04A0" w:firstRow="1" w:lastRow="0" w:firstColumn="1" w:lastColumn="0" w:noHBand="0" w:noVBand="1"/>
       </w:tblPr>
       <w:tblGrid>
-        <w:gridCol w:w="2200"/>
-        <w:gridCol w:w="1900"/>
-        <w:gridCol w:w="1900"/>
-        <w:gridCol w:w="1900"/>
+        <w:gridCol w:w="2000"/>
+        <w:gridCol w:w="1400"/>
+        <w:gridCol w:w="1400"/>
+        <w:gridCol w:w="1400"/>
       </w:tblGrid>
       <w:tr>
         <w:tc>
           <w:tcPr>
-            <w:tcW w:w="2200" w:type="dxa"/>
+            <w:tcW w:w="2000" w:type="dxa"/>
           </w:tcPr>
           <w:p>
             <w:pPr>
@@ -2701,7 +2701,7 @@
         </w:tc>
         <w:tc>
           <w:tcPr>
-            <w:tcW w:w="1900" w:type="dxa"/>
+            <w:tcW w:w="1400" w:type="dxa"/>
           </w:tcPr>
           <w:p>
             <w:pPr>
@@ -2725,7 +2725,7 @@
         </w:tc>
         <w:tc>
           <w:tcPr>
-            <w:tcW w:w="1900" w:type="dxa"/>
+            <w:tcW w:w="1400" w:type="dxa"/>
           </w:tcPr>
           <w:p>
             <w:pPr>
@@ -2749,7 +2749,7 @@
         </w:tc>
         <w:tc>
           <w:tcPr>
-            <w:tcW w:w="1900" w:type="dxa"/>
+            <w:tcW w:w="1400" w:type="dxa"/>
           </w:tcPr>
           <w:p>
             <w:pPr>
@@ -2775,7 +2775,7 @@
       <w:tr>
         <w:tc>
           <w:tcPr>
-            <w:tcW w:w="2200" w:type="dxa"/>
+            <w:tcW w:w="2000" w:type="dxa"/>
           </w:tcPr>
           <w:p>
             <w:pPr>
@@ -2817,7 +2817,7 @@
         </w:tc>
         <w:tc>
           <w:tcPr>
-            <w:tcW w:w="1900" w:type="dxa"/>
+            <w:tcW w:w="1400" w:type="dxa"/>
           </w:tcPr>
           <w:p>
             <w:pPr>
@@ -2841,7 +2841,7 @@
         </w:tc>
         <w:tc>
           <w:tcPr>
-            <w:tcW w:w="1900" w:type="dxa"/>
+            <w:tcW w:w="1400" w:type="dxa"/>
           </w:tcPr>
           <w:p>
             <w:pPr>
@@ -2865,7 +2865,7 @@
         </w:tc>
         <w:tc>
           <w:tcPr>
-            <w:tcW w:w="1900" w:type="dxa"/>
+            <w:tcW w:w="1400" w:type="dxa"/>
           </w:tcPr>
           <w:p>
             <w:pPr>

</xml_diff>